<commit_message>
Separar en lineas los campos pegados de las plantillas oficiales F5, F6 y F7
Regional/Centro Zonal/No. de peticion y Direccion/Barrio/Municipio/Tel.
quedaban en una sola linea del documento Word exportado, sin espacio
visual entre cada campo y su respuesta. Se agrega un salto de linea
entre cada etiqueta dentro del mismo run (misma fuente/tamano), sin
tocar texto, orden ni estructura del formato oficial. F3 y F10 se
revisaron tambien: no tienen lineas con campos pegados (solo casillas
de verificacion, oraciones con blancos incrustados o celdas de tabla),
asi que no requirieron cambios.

Verificado llenando cada plantilla con docxtemplater fuera de la app
(XML valido, saltos en el lugar correcto) y dentro de la app real
corriendo en el navegador (F7, F5, F6 llenados y descargados sin
errores de consola).

Co-Authored-By: Claude Sonnet 5 <noreply@anthropic.com>
</commit_message>
<xml_diff>
--- a/app/public/plantillas/F5-Encuentros-Comunitarios.docx
+++ b/app/public/plantillas/F5-Encuentros-Comunitarios.docx
@@ -160,7 +160,23 @@
           <w:b/>
           <w:bCs/>
         </w:rPr>
-        <w:t xml:space="preserve">Regional: {regional}   Centro Zonal: {centroZonal}    </w:t>
+        <w:t xml:space="preserve">Regional: {regional}</w:t>
+      </w:r>
+      <w:r>
+        <w:rPr>
+          <w:rFonts w:ascii="Arial" w:hAnsi="Arial" w:cs="Arial"/>
+          <w:b/>
+          <w:bCs/>
+        </w:rPr>
+        <w:br/>
+      </w:r>
+      <w:r>
+        <w:rPr>
+          <w:rFonts w:ascii="Arial" w:hAnsi="Arial" w:cs="Arial"/>
+          <w:b/>
+          <w:bCs/>
+        </w:rPr>
+        <w:t xml:space="preserve">Centro Zonal: {centroZonal}    </w:t>
       </w:r>
       <w:r>
         <w:rPr>

</xml_diff>